<commit_message>
Documents and Data Process Work
</commit_message>
<xml_diff>
--- a/ApplicationDocs/Client_Doc/DMT_HRMS_FMS.docx
+++ b/ApplicationDocs/Client_Doc/DMT_HRMS_FMS.docx
@@ -1,6 +1,6 @@
 
 <file path=word/document.xml><?xml version="1.0" encoding="utf-8"?>
-<w:document xmlns:wpc="http://schemas.microsoft.com/office/word/2010/wordprocessingCanvas" xmlns:cx="http://schemas.microsoft.com/office/drawing/2014/chartex" xmlns:cx1="http://schemas.microsoft.com/office/drawing/2015/9/8/chartex" xmlns:cx2="http://schemas.microsoft.com/office/drawing/2015/10/21/chartex" xmlns:cx3="http://schemas.microsoft.com/office/drawing/2016/5/9/chartex" xmlns:cx4="http://schemas.microsoft.com/office/drawing/2016/5/10/chartex" xmlns:cx5="http://schemas.microsoft.com/office/drawing/2016/5/11/chartex" xmlns:cx6="http://schemas.microsoft.com/office/drawing/2016/5/12/chartex" xmlns:cx7="http://schemas.microsoft.com/office/drawing/2016/5/13/chartex" xmlns:cx8="http://schemas.microsoft.com/office/drawing/2016/5/14/chartex" xmlns:mc="http://schemas.openxmlformats.org/markup-compatibility/2006" xmlns:aink="http://schemas.microsoft.com/office/drawing/2016/ink" xmlns:am3d="http://schemas.microsoft.com/office/drawing/2017/model3d" xmlns:o="urn:schemas-microsoft-com:office:office" xmlns:oel="http://schemas.microsoft.com/office/2019/extlst" xmlns:r="http://schemas.openxmlformats.org/officeDocument/2006/relationships" xmlns:m="http://schemas.openxmlformats.org/officeDocument/2006/math" xmlns:v="urn:schemas-microsoft-com:vml" xmlns:wp14="http://schemas.microsoft.com/office/word/2010/wordprocessingDrawing" xmlns:wp="http://schemas.openxmlformats.org/drawingml/2006/wordprocessingDrawing" xmlns:w10="urn:schemas-microsoft-com:office:word" xmlns:w="http://schemas.openxmlformats.org/wordprocessingml/2006/main" xmlns:w14="http://schemas.microsoft.com/office/word/2010/wordml" xmlns:w15="http://schemas.microsoft.com/office/word/2012/wordml" xmlns:w16cex="http://schemas.microsoft.com/office/word/2018/wordml/cex" xmlns:w16cid="http://schemas.microsoft.com/office/word/2016/wordml/cid" xmlns:w16="http://schemas.microsoft.com/office/word/2018/wordml" xmlns:w16du="http://schemas.microsoft.com/office/word/2023/wordml/word16du" xmlns:w16sdtdh="http://schemas.microsoft.com/office/word/2020/wordml/sdtdatahash" xmlns:w16sdtfl="http://schemas.microsoft.com/office/word/2024/wordml/sdtformatlock" xmlns:w16se="http://schemas.microsoft.com/office/word/2015/wordml/symex" xmlns:wpg="http://schemas.microsoft.com/office/word/2010/wordprocessingGroup" xmlns:wpi="http://schemas.microsoft.com/office/word/2010/wordprocessingInk" xmlns:wne="http://schemas.microsoft.com/office/word/2006/wordml" xmlns:wps="http://schemas.microsoft.com/office/word/2010/wordprocessingShape" mc:Ignorable="w14 w15 w16se w16cid w16 w16cex w16sdtdh w16sdtfl w16du wp14">
+<w:document xmlns:wpc="http://schemas.microsoft.com/office/word/2010/wordprocessingCanvas" xmlns:cx="http://schemas.microsoft.com/office/drawing/2014/chartex" xmlns:cx1="http://schemas.microsoft.com/office/drawing/2015/9/8/chartex" xmlns:cx2="http://schemas.microsoft.com/office/drawing/2015/10/21/chartex" xmlns:cx3="http://schemas.microsoft.com/office/drawing/2016/5/9/chartex" xmlns:cx4="http://schemas.microsoft.com/office/drawing/2016/5/10/chartex" xmlns:cx5="http://schemas.microsoft.com/office/drawing/2016/5/11/chartex" xmlns:cx6="http://schemas.microsoft.com/office/drawing/2016/5/12/chartex" xmlns:cx7="http://schemas.microsoft.com/office/drawing/2016/5/13/chartex" xmlns:cx8="http://schemas.microsoft.com/office/drawing/2016/5/14/chartex" xmlns:mc="http://schemas.openxmlformats.org/markup-compatibility/2006" xmlns:aink="http://schemas.microsoft.com/office/drawing/2016/ink" xmlns:am3d="http://schemas.microsoft.com/office/drawing/2017/model3d" xmlns:o="urn:schemas-microsoft-com:office:office" xmlns:r="http://schemas.openxmlformats.org/officeDocument/2006/relationships" xmlns:m="http://schemas.openxmlformats.org/officeDocument/2006/math" xmlns:v="urn:schemas-microsoft-com:vml" xmlns:wp14="http://schemas.microsoft.com/office/word/2010/wordprocessingDrawing" xmlns:wp="http://schemas.openxmlformats.org/drawingml/2006/wordprocessingDrawing" xmlns:w10="urn:schemas-microsoft-com:office:word" xmlns:w="http://schemas.openxmlformats.org/wordprocessingml/2006/main" xmlns:w14="http://schemas.microsoft.com/office/word/2010/wordml" xmlns:w15="http://schemas.microsoft.com/office/word/2012/wordml" xmlns:w16cex="http://schemas.microsoft.com/office/word/2018/wordml/cex" xmlns:w16cid="http://schemas.microsoft.com/office/word/2016/wordml/cid" xmlns:w16="http://schemas.microsoft.com/office/word/2018/wordml" xmlns:w16sdtdh="http://schemas.microsoft.com/office/word/2020/wordml/sdtdatahash" xmlns:w16se="http://schemas.microsoft.com/office/word/2015/wordml/symex" xmlns:wpg="http://schemas.microsoft.com/office/word/2010/wordprocessingGroup" xmlns:wpi="http://schemas.microsoft.com/office/word/2010/wordprocessingInk" xmlns:wne="http://schemas.microsoft.com/office/word/2006/wordml" xmlns:wps="http://schemas.microsoft.com/office/word/2010/wordprocessingShape" mc:Ignorable="w14 w15 w16se w16cid w16 w16cex w16sdtdh wp14">
   <w:body>
     <w:p>
       <w:pPr>
@@ -58,6 +58,166 @@
           <w:lang w:val="en-GB" w:eastAsia="en-US"/>
         </w:rPr>
       </w:pPr>
+      <w:r>
+        <w:rPr>
+          <w:rFonts w:ascii="AppleSystemUIFont" w:eastAsiaTheme="minorHAnsi" w:hAnsi="AppleSystemUIFont" w:cs="AppleSystemUIFont"/>
+          <w:sz w:val="26"/>
+          <w:szCs w:val="26"/>
+          <w:lang w:val="en-GB" w:eastAsia="en-US"/>
+        </w:rPr>
+        <w:t>For MAC</w:t>
+      </w:r>
+    </w:p>
+    <w:p>
+      <w:pPr>
+        <w:autoSpaceDE w:val="0"/>
+        <w:autoSpaceDN w:val="0"/>
+        <w:adjustRightInd w:val="0"/>
+        <w:ind w:left="720"/>
+        <w:rPr>
+          <w:rFonts w:ascii="AppleSystemUIFont" w:eastAsiaTheme="minorHAnsi" w:hAnsi="AppleSystemUIFont" w:cs="AppleSystemUIFont"/>
+          <w:sz w:val="26"/>
+          <w:szCs w:val="26"/>
+          <w:lang w:val="en-GB" w:eastAsia="en-US"/>
+        </w:rPr>
+      </w:pPr>
+    </w:p>
+    <w:p>
+      <w:pPr>
+        <w:autoSpaceDE w:val="0"/>
+        <w:autoSpaceDN w:val="0"/>
+        <w:adjustRightInd w:val="0"/>
+        <w:rPr>
+          <w:rFonts w:ascii="AppleSystemUIFont" w:eastAsiaTheme="minorHAnsi" w:hAnsi="AppleSystemUIFont" w:cs="AppleSystemUIFont"/>
+          <w:sz w:val="26"/>
+          <w:szCs w:val="26"/>
+          <w:lang w:val="en-GB" w:eastAsia="en-US"/>
+        </w:rPr>
+      </w:pPr>
+      <w:r>
+        <w:rPr>
+          <w:rFonts w:ascii="AppleSystemUIFont" w:eastAsiaTheme="minorHAnsi" w:hAnsi="AppleSystemUIFont" w:cs="AppleSystemUIFont"/>
+          <w:sz w:val="26"/>
+          <w:szCs w:val="26"/>
+          <w:lang w:val="en-GB" w:eastAsia="en-US"/>
+        </w:rPr>
+        <w:t xml:space="preserve">Python3 -m </w:t>
+      </w:r>
+      <w:proofErr w:type="spellStart"/>
+      <w:r>
+        <w:rPr>
+          <w:rFonts w:ascii="AppleSystemUIFont" w:eastAsiaTheme="minorHAnsi" w:hAnsi="AppleSystemUIFont" w:cs="AppleSystemUIFont"/>
+          <w:sz w:val="26"/>
+          <w:szCs w:val="26"/>
+          <w:lang w:val="en-GB" w:eastAsia="en-US"/>
+        </w:rPr>
+        <w:t>venv</w:t>
+      </w:r>
+      <w:proofErr w:type="spellEnd"/>
+      <w:r>
+        <w:rPr>
+          <w:rFonts w:ascii="AppleSystemUIFont" w:eastAsiaTheme="minorHAnsi" w:hAnsi="AppleSystemUIFont" w:cs="AppleSystemUIFont"/>
+          <w:sz w:val="26"/>
+          <w:szCs w:val="26"/>
+          <w:lang w:val="en-GB" w:eastAsia="en-US"/>
+        </w:rPr>
+        <w:t xml:space="preserve"> </w:t>
+      </w:r>
+      <w:proofErr w:type="spellStart"/>
+      <w:r>
+        <w:rPr>
+          <w:rFonts w:ascii="AppleSystemUIFont" w:eastAsiaTheme="minorHAnsi" w:hAnsi="AppleSystemUIFont" w:cs="AppleSystemUIFont"/>
+          <w:sz w:val="26"/>
+          <w:szCs w:val="26"/>
+          <w:lang w:val="en-GB" w:eastAsia="en-US"/>
+        </w:rPr>
+        <w:t>venv</w:t>
+      </w:r>
+      <w:proofErr w:type="spellEnd"/>
+    </w:p>
+    <w:p>
+      <w:pPr>
+        <w:autoSpaceDE w:val="0"/>
+        <w:autoSpaceDN w:val="0"/>
+        <w:adjustRightInd w:val="0"/>
+        <w:rPr>
+          <w:rFonts w:ascii="AppleSystemUIFont" w:eastAsiaTheme="minorHAnsi" w:hAnsi="AppleSystemUIFont" w:cs="AppleSystemUIFont"/>
+          <w:sz w:val="26"/>
+          <w:szCs w:val="26"/>
+          <w:lang w:val="en-GB" w:eastAsia="en-US"/>
+        </w:rPr>
+      </w:pPr>
+      <w:r>
+        <w:rPr>
+          <w:rFonts w:ascii="AppleSystemUIFont" w:eastAsiaTheme="minorHAnsi" w:hAnsi="AppleSystemUIFont" w:cs="AppleSystemUIFont"/>
+          <w:sz w:val="26"/>
+          <w:szCs w:val="26"/>
+          <w:lang w:val="en-GB" w:eastAsia="en-US"/>
+        </w:rPr>
+        <w:t xml:space="preserve">source </w:t>
+      </w:r>
+      <w:proofErr w:type="spellStart"/>
+      <w:r>
+        <w:rPr>
+          <w:rFonts w:ascii="AppleSystemUIFont" w:eastAsiaTheme="minorHAnsi" w:hAnsi="AppleSystemUIFont" w:cs="AppleSystemUIFont"/>
+          <w:sz w:val="26"/>
+          <w:szCs w:val="26"/>
+          <w:lang w:val="en-GB" w:eastAsia="en-US"/>
+        </w:rPr>
+        <w:t>venv</w:t>
+      </w:r>
+      <w:proofErr w:type="spellEnd"/>
+      <w:r>
+        <w:rPr>
+          <w:rFonts w:ascii="AppleSystemUIFont" w:eastAsiaTheme="minorHAnsi" w:hAnsi="AppleSystemUIFont" w:cs="AppleSystemUIFont"/>
+          <w:sz w:val="26"/>
+          <w:szCs w:val="26"/>
+          <w:lang w:val="en-GB" w:eastAsia="en-US"/>
+        </w:rPr>
+        <w:t>/bin/activate</w:t>
+      </w:r>
+    </w:p>
+    <w:p>
+      <w:pPr>
+        <w:autoSpaceDE w:val="0"/>
+        <w:autoSpaceDN w:val="0"/>
+        <w:adjustRightInd w:val="0"/>
+        <w:ind w:left="720"/>
+        <w:rPr>
+          <w:rFonts w:ascii="AppleSystemUIFont" w:eastAsiaTheme="minorHAnsi" w:hAnsi="AppleSystemUIFont" w:cs="AppleSystemUIFont"/>
+          <w:sz w:val="26"/>
+          <w:szCs w:val="26"/>
+          <w:lang w:val="en-GB" w:eastAsia="en-US"/>
+        </w:rPr>
+      </w:pPr>
+    </w:p>
+    <w:p>
+      <w:pPr>
+        <w:autoSpaceDE w:val="0"/>
+        <w:autoSpaceDN w:val="0"/>
+        <w:adjustRightInd w:val="0"/>
+        <w:ind w:left="720"/>
+        <w:rPr>
+          <w:rFonts w:ascii="AppleSystemUIFont" w:eastAsiaTheme="minorHAnsi" w:hAnsi="AppleSystemUIFont" w:cs="AppleSystemUIFont"/>
+          <w:sz w:val="26"/>
+          <w:szCs w:val="26"/>
+          <w:lang w:val="en-GB" w:eastAsia="en-US"/>
+        </w:rPr>
+      </w:pPr>
+    </w:p>
+    <w:p>
+      <w:pPr>
+        <w:autoSpaceDE w:val="0"/>
+        <w:autoSpaceDN w:val="0"/>
+        <w:adjustRightInd w:val="0"/>
+        <w:ind w:left="720"/>
+        <w:rPr>
+          <w:rFonts w:ascii="AppleSystemUIFont" w:eastAsiaTheme="minorHAnsi" w:hAnsi="AppleSystemUIFont" w:cs="AppleSystemUIFont"/>
+          <w:sz w:val="26"/>
+          <w:szCs w:val="26"/>
+          <w:lang w:val="en-GB" w:eastAsia="en-US"/>
+        </w:rPr>
+      </w:pPr>
     </w:p>
     <w:p>
       <w:pPr>
@@ -506,14 +666,6 @@
     </w:p>
     <w:p>
       <w:pPr>
-        <w:rPr>
-          <w:sz w:val="28"/>
-          <w:szCs w:val="28"/>
-        </w:rPr>
-      </w:pPr>
-    </w:p>
-    <w:p>
-      <w:pPr>
         <w:pStyle w:val="ListParagraph"/>
         <w:numPr>
           <w:ilvl w:val="0"/>
@@ -524,59 +676,20 @@
           <w:szCs w:val="28"/>
         </w:rPr>
       </w:pPr>
-      <w:proofErr w:type="spellStart"/>
-      <w:r>
-        <w:rPr>
-          <w:sz w:val="28"/>
-          <w:szCs w:val="28"/>
-        </w:rPr>
-        <w:t>django</w:t>
-      </w:r>
-      <w:proofErr w:type="spellEnd"/>
-      <w:r>
-        <w:rPr>
-          <w:sz w:val="28"/>
-          <w:szCs w:val="28"/>
-        </w:rPr>
-        <w:t xml:space="preserve">-admin </w:t>
-      </w:r>
-      <w:proofErr w:type="spellStart"/>
-      <w:r>
-        <w:rPr>
-          <w:sz w:val="28"/>
-          <w:szCs w:val="28"/>
-        </w:rPr>
-        <w:t>startproject</w:t>
-      </w:r>
-      <w:proofErr w:type="spellEnd"/>
-      <w:r>
-        <w:rPr>
-          <w:sz w:val="28"/>
-          <w:szCs w:val="28"/>
-        </w:rPr>
-        <w:t xml:space="preserve"> </w:t>
-      </w:r>
-      <w:proofErr w:type="spellStart"/>
-      <w:r>
-        <w:rPr>
-          <w:sz w:val="28"/>
-          <w:szCs w:val="28"/>
-        </w:rPr>
-        <w:t>DmtHrmsFm</w:t>
-      </w:r>
-      <w:r>
-        <w:rPr>
-          <w:sz w:val="28"/>
-          <w:szCs w:val="28"/>
-        </w:rPr>
-        <w:t>s</w:t>
-      </w:r>
-      <w:r>
-        <w:rPr>
-          <w:sz w:val="28"/>
-          <w:szCs w:val="28"/>
-        </w:rPr>
-        <w:t>App</w:t>
+      <w:r>
+        <w:rPr>
+          <w:sz w:val="28"/>
+          <w:szCs w:val="28"/>
+        </w:rPr>
+        <w:t>pip install python-</w:t>
+      </w:r>
+      <w:proofErr w:type="spellStart"/>
+      <w:r>
+        <w:rPr>
+          <w:sz w:val="28"/>
+          <w:szCs w:val="28"/>
+        </w:rPr>
+        <w:t>dotenv</w:t>
       </w:r>
       <w:proofErr w:type="spellEnd"/>
     </w:p>
@@ -592,7 +705,144 @@
           <w:szCs w:val="28"/>
         </w:rPr>
       </w:pPr>
-      <w:proofErr w:type="gramStart"/>
+      <w:r>
+        <w:rPr>
+          <w:sz w:val="28"/>
+          <w:szCs w:val="28"/>
+        </w:rPr>
+        <w:t xml:space="preserve">pip install </w:t>
+      </w:r>
+      <w:proofErr w:type="spellStart"/>
+      <w:r>
+        <w:rPr>
+          <w:sz w:val="28"/>
+          <w:szCs w:val="28"/>
+        </w:rPr>
+        <w:t>openpyxl</w:t>
+      </w:r>
+      <w:proofErr w:type="spellEnd"/>
+    </w:p>
+    <w:p>
+      <w:pPr>
+        <w:pStyle w:val="ListParagraph"/>
+        <w:numPr>
+          <w:ilvl w:val="0"/>
+          <w:numId w:val="1"/>
+        </w:numPr>
+        <w:rPr>
+          <w:sz w:val="28"/>
+          <w:szCs w:val="28"/>
+        </w:rPr>
+      </w:pPr>
+      <w:r>
+        <w:rPr>
+          <w:sz w:val="28"/>
+          <w:szCs w:val="28"/>
+        </w:rPr>
+        <w:t>pip install pandas</w:t>
+      </w:r>
+    </w:p>
+    <w:p>
+      <w:pPr>
+        <w:pStyle w:val="ListParagraph"/>
+        <w:numPr>
+          <w:ilvl w:val="0"/>
+          <w:numId w:val="1"/>
+        </w:numPr>
+        <w:rPr>
+          <w:sz w:val="28"/>
+          <w:szCs w:val="28"/>
+        </w:rPr>
+      </w:pPr>
+    </w:p>
+    <w:p>
+      <w:pPr>
+        <w:rPr>
+          <w:sz w:val="28"/>
+          <w:szCs w:val="28"/>
+        </w:rPr>
+      </w:pPr>
+    </w:p>
+    <w:p>
+      <w:pPr>
+        <w:pStyle w:val="ListParagraph"/>
+        <w:numPr>
+          <w:ilvl w:val="0"/>
+          <w:numId w:val="1"/>
+        </w:numPr>
+        <w:rPr>
+          <w:sz w:val="28"/>
+          <w:szCs w:val="28"/>
+        </w:rPr>
+      </w:pPr>
+      <w:proofErr w:type="spellStart"/>
+      <w:r>
+        <w:rPr>
+          <w:sz w:val="28"/>
+          <w:szCs w:val="28"/>
+        </w:rPr>
+        <w:t>django</w:t>
+      </w:r>
+      <w:proofErr w:type="spellEnd"/>
+      <w:r>
+        <w:rPr>
+          <w:sz w:val="28"/>
+          <w:szCs w:val="28"/>
+        </w:rPr>
+        <w:t xml:space="preserve">-admin </w:t>
+      </w:r>
+      <w:proofErr w:type="spellStart"/>
+      <w:r>
+        <w:rPr>
+          <w:sz w:val="28"/>
+          <w:szCs w:val="28"/>
+        </w:rPr>
+        <w:t>startproject</w:t>
+      </w:r>
+      <w:proofErr w:type="spellEnd"/>
+      <w:r>
+        <w:rPr>
+          <w:sz w:val="28"/>
+          <w:szCs w:val="28"/>
+        </w:rPr>
+        <w:t xml:space="preserve"> </w:t>
+      </w:r>
+      <w:proofErr w:type="spellStart"/>
+      <w:r>
+        <w:rPr>
+          <w:sz w:val="28"/>
+          <w:szCs w:val="28"/>
+        </w:rPr>
+        <w:t>DmtHrmsFm</w:t>
+      </w:r>
+      <w:r>
+        <w:rPr>
+          <w:sz w:val="28"/>
+          <w:szCs w:val="28"/>
+        </w:rPr>
+        <w:t>s</w:t>
+      </w:r>
+      <w:r>
+        <w:rPr>
+          <w:sz w:val="28"/>
+          <w:szCs w:val="28"/>
+        </w:rPr>
+        <w:t>App</w:t>
+      </w:r>
+      <w:proofErr w:type="spellEnd"/>
+    </w:p>
+    <w:p>
+      <w:pPr>
+        <w:pStyle w:val="ListParagraph"/>
+        <w:numPr>
+          <w:ilvl w:val="0"/>
+          <w:numId w:val="1"/>
+        </w:numPr>
+        <w:rPr>
+          <w:sz w:val="28"/>
+          <w:szCs w:val="28"/>
+        </w:rPr>
+      </w:pPr>
       <w:r>
         <w:rPr>
           <w:sz w:val="28"/>
@@ -630,7 +880,6 @@
         <w:t>App</w:t>
       </w:r>
       <w:proofErr w:type="spellEnd"/>
-      <w:proofErr w:type="gramEnd"/>
     </w:p>
     <w:p>
       <w:pPr>
@@ -856,9 +1105,8 @@
           <w:sz w:val="28"/>
           <w:szCs w:val="28"/>
         </w:rPr>
-        <w:t>@SU</w:t>
-      </w:r>
-      <w:proofErr w:type="gramStart"/>
+        <w:t>@SU#</w:t>
+      </w:r>
       <w:r>
         <w:rPr>
           <w:b/>
@@ -866,26 +1114,7 @@
           <w:sz w:val="28"/>
           <w:szCs w:val="28"/>
         </w:rPr>
-        <w:t>#</w:t>
-      </w:r>
-      <w:r>
-        <w:rPr>
-          <w:b/>
-          <w:bCs/>
-          <w:sz w:val="28"/>
-          <w:szCs w:val="28"/>
-        </w:rPr>
-        <w:t xml:space="preserve">  (</w:t>
-      </w:r>
-      <w:proofErr w:type="gramEnd"/>
-      <w:r>
-        <w:rPr>
-          <w:b/>
-          <w:bCs/>
-          <w:sz w:val="28"/>
-          <w:szCs w:val="28"/>
-        </w:rPr>
-        <w:t>DJANGO Admin)</w:t>
+        <w:t xml:space="preserve">  (DJANGO Admin)</w:t>
       </w:r>
     </w:p>
     <w:p>
@@ -944,6 +1173,7 @@
           <w:sz w:val="28"/>
           <w:szCs w:val="28"/>
         </w:rPr>
+        <w:lastRenderedPageBreak/>
         <w:t xml:space="preserve">python manage.py </w:t>
       </w:r>
       <w:proofErr w:type="spellStart"/>
@@ -1255,22 +1485,7 @@
           <w:szCs w:val="28"/>
         </w:rPr>
         <w:tab/>
-      </w:r>
-      <w:proofErr w:type="gramStart"/>
-      <w:r>
-        <w:rPr>
-          <w:sz w:val="28"/>
-          <w:szCs w:val="28"/>
-        </w:rPr>
-        <w:t>Name :</w:t>
-      </w:r>
-      <w:proofErr w:type="gramEnd"/>
-      <w:r>
-        <w:rPr>
-          <w:sz w:val="28"/>
-          <w:szCs w:val="28"/>
-        </w:rPr>
-        <w:t xml:space="preserve"> </w:t>
+        <w:t xml:space="preserve">Name : </w:t>
       </w:r>
       <w:r>
         <w:rPr>
@@ -1293,22 +1508,7 @@
           <w:szCs w:val="28"/>
         </w:rPr>
         <w:tab/>
-      </w:r>
-      <w:proofErr w:type="gramStart"/>
-      <w:r>
-        <w:rPr>
-          <w:sz w:val="28"/>
-          <w:szCs w:val="28"/>
-        </w:rPr>
-        <w:t>UID :</w:t>
-      </w:r>
-      <w:proofErr w:type="gramEnd"/>
-      <w:r>
-        <w:rPr>
-          <w:sz w:val="28"/>
-          <w:szCs w:val="28"/>
-        </w:rPr>
-        <w:t xml:space="preserve"> </w:t>
+        <w:t xml:space="preserve">UID : </w:t>
       </w:r>
       <w:r>
         <w:rPr>
@@ -1331,22 +1531,7 @@
           <w:szCs w:val="28"/>
         </w:rPr>
         <w:tab/>
-      </w:r>
-      <w:proofErr w:type="gramStart"/>
-      <w:r>
-        <w:rPr>
-          <w:sz w:val="28"/>
-          <w:szCs w:val="28"/>
-        </w:rPr>
-        <w:t>PWD :</w:t>
-      </w:r>
-      <w:proofErr w:type="gramEnd"/>
-      <w:r>
-        <w:rPr>
-          <w:sz w:val="28"/>
-          <w:szCs w:val="28"/>
-        </w:rPr>
-        <w:t xml:space="preserve"> </w:t>
+        <w:t xml:space="preserve">PWD : </w:t>
       </w:r>
       <w:r>
         <w:rPr>
@@ -1586,7 +1771,7 @@
 </file>
 
 <file path=word/numbering.xml><?xml version="1.0" encoding="utf-8"?>
-<w:numbering xmlns:wpc="http://schemas.microsoft.com/office/word/2010/wordprocessingCanvas" xmlns:cx="http://schemas.microsoft.com/office/drawing/2014/chartex" xmlns:cx1="http://schemas.microsoft.com/office/drawing/2015/9/8/chartex" xmlns:cx2="http://schemas.microsoft.com/office/drawing/2015/10/21/chartex" xmlns:cx3="http://schemas.microsoft.com/office/drawing/2016/5/9/chartex" xmlns:cx4="http://schemas.microsoft.com/office/drawing/2016/5/10/chartex" xmlns:cx5="http://schemas.microsoft.com/office/drawing/2016/5/11/chartex" xmlns:cx6="http://schemas.microsoft.com/office/drawing/2016/5/12/chartex" xmlns:cx7="http://schemas.microsoft.com/office/drawing/2016/5/13/chartex" xmlns:cx8="http://schemas.microsoft.com/office/drawing/2016/5/14/chartex" xmlns:mc="http://schemas.openxmlformats.org/markup-compatibility/2006" xmlns:aink="http://schemas.microsoft.com/office/drawing/2016/ink" xmlns:am3d="http://schemas.microsoft.com/office/drawing/2017/model3d" xmlns:o="urn:schemas-microsoft-com:office:office" xmlns:oel="http://schemas.microsoft.com/office/2019/extlst" xmlns:r="http://schemas.openxmlformats.org/officeDocument/2006/relationships" xmlns:m="http://schemas.openxmlformats.org/officeDocument/2006/math" xmlns:v="urn:schemas-microsoft-com:vml" xmlns:wp14="http://schemas.microsoft.com/office/word/2010/wordprocessingDrawing" xmlns:wp="http://schemas.openxmlformats.org/drawingml/2006/wordprocessingDrawing" xmlns:w10="urn:schemas-microsoft-com:office:word" xmlns:w="http://schemas.openxmlformats.org/wordprocessingml/2006/main" xmlns:w14="http://schemas.microsoft.com/office/word/2010/wordml" xmlns:w15="http://schemas.microsoft.com/office/word/2012/wordml" xmlns:w16cex="http://schemas.microsoft.com/office/word/2018/wordml/cex" xmlns:w16cid="http://schemas.microsoft.com/office/word/2016/wordml/cid" xmlns:w16="http://schemas.microsoft.com/office/word/2018/wordml" xmlns:w16du="http://schemas.microsoft.com/office/word/2023/wordml/word16du" xmlns:w16sdtdh="http://schemas.microsoft.com/office/word/2020/wordml/sdtdatahash" xmlns:w16sdtfl="http://schemas.microsoft.com/office/word/2024/wordml/sdtformatlock" xmlns:w16se="http://schemas.microsoft.com/office/word/2015/wordml/symex" xmlns:wpg="http://schemas.microsoft.com/office/word/2010/wordprocessingGroup" xmlns:wpi="http://schemas.microsoft.com/office/word/2010/wordprocessingInk" xmlns:wne="http://schemas.microsoft.com/office/word/2006/wordml" xmlns:wps="http://schemas.microsoft.com/office/word/2010/wordprocessingShape" mc:Ignorable="w14 w15 w16se w16cid w16 w16cex w16sdtdh w16sdtfl w16du wp14">
+<w:numbering xmlns:wpc="http://schemas.microsoft.com/office/word/2010/wordprocessingCanvas" xmlns:cx="http://schemas.microsoft.com/office/drawing/2014/chartex" xmlns:cx1="http://schemas.microsoft.com/office/drawing/2015/9/8/chartex" xmlns:cx2="http://schemas.microsoft.com/office/drawing/2015/10/21/chartex" xmlns:cx3="http://schemas.microsoft.com/office/drawing/2016/5/9/chartex" xmlns:cx4="http://schemas.microsoft.com/office/drawing/2016/5/10/chartex" xmlns:cx5="http://schemas.microsoft.com/office/drawing/2016/5/11/chartex" xmlns:cx6="http://schemas.microsoft.com/office/drawing/2016/5/12/chartex" xmlns:cx7="http://schemas.microsoft.com/office/drawing/2016/5/13/chartex" xmlns:cx8="http://schemas.microsoft.com/office/drawing/2016/5/14/chartex" xmlns:mc="http://schemas.openxmlformats.org/markup-compatibility/2006" xmlns:aink="http://schemas.microsoft.com/office/drawing/2016/ink" xmlns:am3d="http://schemas.microsoft.com/office/drawing/2017/model3d" xmlns:o="urn:schemas-microsoft-com:office:office" xmlns:r="http://schemas.openxmlformats.org/officeDocument/2006/relationships" xmlns:m="http://schemas.openxmlformats.org/officeDocument/2006/math" xmlns:v="urn:schemas-microsoft-com:vml" xmlns:wp14="http://schemas.microsoft.com/office/word/2010/wordprocessingDrawing" xmlns:wp="http://schemas.openxmlformats.org/drawingml/2006/wordprocessingDrawing" xmlns:w10="urn:schemas-microsoft-com:office:word" xmlns:w="http://schemas.openxmlformats.org/wordprocessingml/2006/main" xmlns:w14="http://schemas.microsoft.com/office/word/2010/wordml" xmlns:w15="http://schemas.microsoft.com/office/word/2012/wordml" xmlns:w16cex="http://schemas.microsoft.com/office/word/2018/wordml/cex" xmlns:w16cid="http://schemas.microsoft.com/office/word/2016/wordml/cid" xmlns:w16="http://schemas.microsoft.com/office/word/2018/wordml" xmlns:w16sdtdh="http://schemas.microsoft.com/office/word/2020/wordml/sdtdatahash" xmlns:w16se="http://schemas.microsoft.com/office/word/2015/wordml/symex" xmlns:wpg="http://schemas.microsoft.com/office/word/2010/wordprocessingGroup" xmlns:wpi="http://schemas.microsoft.com/office/word/2010/wordprocessingInk" xmlns:wne="http://schemas.microsoft.com/office/word/2006/wordml" xmlns:wps="http://schemas.microsoft.com/office/word/2010/wordprocessingShape" mc:Ignorable="w14 w15 w16se w16cid w16 w16cex w16sdtdh wp14">
   <w:abstractNum w:abstractNumId="0" w15:restartNumberingAfterBreak="0">
     <w:nsid w:val="15DC427F"/>
     <w:multiLevelType w:val="hybridMultilevel"/>
@@ -2252,25 +2437,25 @@
       </w:pPr>
     </w:lvl>
   </w:abstractNum>
-  <w:num w:numId="1" w16cid:durableId="1680814238">
+  <w:num w:numId="1">
     <w:abstractNumId w:val="0"/>
   </w:num>
-  <w:num w:numId="2" w16cid:durableId="638803026">
+  <w:num w:numId="2">
     <w:abstractNumId w:val="1"/>
   </w:num>
-  <w:num w:numId="3" w16cid:durableId="192379048">
+  <w:num w:numId="3">
     <w:abstractNumId w:val="5"/>
   </w:num>
-  <w:num w:numId="4" w16cid:durableId="1539394416">
+  <w:num w:numId="4">
     <w:abstractNumId w:val="4"/>
   </w:num>
-  <w:num w:numId="5" w16cid:durableId="285744965">
+  <w:num w:numId="5">
     <w:abstractNumId w:val="2"/>
   </w:num>
-  <w:num w:numId="6" w16cid:durableId="703480494">
+  <w:num w:numId="6">
     <w:abstractNumId w:val="6"/>
   </w:num>
-  <w:num w:numId="7" w16cid:durableId="1196575648">
+  <w:num w:numId="7">
     <w:abstractNumId w:val="3"/>
     <w:lvlOverride w:ilvl="0">
       <w:lvl w:ilvl="0">
@@ -2294,7 +2479,7 @@
 </file>
 
 <file path=word/styles.xml><?xml version="1.0" encoding="utf-8"?>
-<w:styles xmlns:mc="http://schemas.openxmlformats.org/markup-compatibility/2006" xmlns:r="http://schemas.openxmlformats.org/officeDocument/2006/relationships" xmlns:w="http://schemas.openxmlformats.org/wordprocessingml/2006/main" xmlns:w14="http://schemas.microsoft.com/office/word/2010/wordml" xmlns:w15="http://schemas.microsoft.com/office/word/2012/wordml" xmlns:w16cex="http://schemas.microsoft.com/office/word/2018/wordml/cex" xmlns:w16cid="http://schemas.microsoft.com/office/word/2016/wordml/cid" xmlns:w16="http://schemas.microsoft.com/office/word/2018/wordml" xmlns:w16du="http://schemas.microsoft.com/office/word/2023/wordml/word16du" xmlns:w16sdtdh="http://schemas.microsoft.com/office/word/2020/wordml/sdtdatahash" xmlns:w16sdtfl="http://schemas.microsoft.com/office/word/2024/wordml/sdtformatlock" xmlns:w16se="http://schemas.microsoft.com/office/word/2015/wordml/symex" mc:Ignorable="w14 w15 w16se w16cid w16 w16cex w16sdtdh w16sdtfl w16du">
+<w:styles xmlns:mc="http://schemas.openxmlformats.org/markup-compatibility/2006" xmlns:r="http://schemas.openxmlformats.org/officeDocument/2006/relationships" xmlns:w="http://schemas.openxmlformats.org/wordprocessingml/2006/main" xmlns:w14="http://schemas.microsoft.com/office/word/2010/wordml" xmlns:w15="http://schemas.microsoft.com/office/word/2012/wordml" xmlns:w16cex="http://schemas.microsoft.com/office/word/2018/wordml/cex" xmlns:w16cid="http://schemas.microsoft.com/office/word/2016/wordml/cid" xmlns:w16="http://schemas.microsoft.com/office/word/2018/wordml" xmlns:w16sdtdh="http://schemas.microsoft.com/office/word/2020/wordml/sdtdatahash" xmlns:w16se="http://schemas.microsoft.com/office/word/2015/wordml/symex" mc:Ignorable="w14 w15 w16se w16cid w16 w16cex w16sdtdh">
   <w:docDefaults>
     <w:rPrDefault>
       <w:rPr>
@@ -2691,7 +2876,7 @@
   <w:style w:type="paragraph" w:default="1" w:styleId="Normal">
     <w:name w:val="Normal"/>
     <w:qFormat/>
-    <w:rsid w:val="001609F0"/>
+    <w:rsid w:val="008B284F"/>
     <w:pPr>
       <w:spacing w:after="0" w:line="240" w:lineRule="auto"/>
     </w:pPr>
@@ -2705,6 +2890,7 @@
   <w:style w:type="character" w:default="1" w:styleId="DefaultParagraphFont">
     <w:name w:val="Default Paragraph Font"/>
     <w:uiPriority w:val="1"/>
+    <w:semiHidden/>
     <w:unhideWhenUsed/>
   </w:style>
   <w:style w:type="table" w:default="1" w:styleId="TableNormal">
@@ -2853,6 +3039,18 @@
     <w:name w:val="undefined"/>
     <w:basedOn w:val="DefaultParagraphFont"/>
     <w:rsid w:val="009520F0"/>
+  </w:style>
+  <w:style w:type="character" w:styleId="FollowedHyperlink">
+    <w:name w:val="FollowedHyperlink"/>
+    <w:basedOn w:val="DefaultParagraphFont"/>
+    <w:uiPriority w:val="99"/>
+    <w:semiHidden/>
+    <w:unhideWhenUsed/>
+    <w:rsid w:val="008B284F"/>
+    <w:rPr>
+      <w:color w:val="954F72" w:themeColor="followedHyperlink"/>
+      <w:u w:val="single"/>
+    </w:rPr>
   </w:style>
 </w:styles>
 </file>

</xml_diff>